<commit_message>
Update VERA-SE manuscript with final consolidated draft
</commit_message>
<xml_diff>
--- a/paper/VERA_SE_Manuscript.docx
+++ b/paper/VERA_SE_Manuscript.docx
@@ -1508,7 +1508,935 @@
     </w:p>
     <w:p>
       <w:r>
-        <w:t>The recorded ablation shows that the visible-plus-hidden-plus-behavior configuration eliminated false acceptances on the controlled set. Adding the structural requirement did not reduce false acceptance further and introduced one false rejection. The components therefore should not be described as making equal contributions. Full numerical ablation rows should be transcribed from the frozen ablation artifact before inserting an expanded ablation table.</w:t>
+        <w:t>To investigate the contribution of individual verification signals, we compare five acceptance configurations over the same 240 controlled candidate instances. Table 2 reports accuracy, precision, recall, false-acceptance rate (FAR), and false-rejection rate (FRR).</w:t>
+      </w:r>
+    </w:p>
+    <w:p>
+      <w:pPr>
+        <w:pStyle w:val="Caption"/>
+      </w:pPr>
+      <w:r>
+        <w:t>Table 2. Controlled benchmark ablation results (240 candidate instances).</w:t>
+      </w:r>
+    </w:p>
+    <w:tbl>
+      <w:tblPr>
+        <w:tblStyle w:val="TableGrid"/>
+        <w:tblW w:type="auto" w:w="0"/>
+        <w:jc w:val="center"/>
+        <w:tblLayout w:type="fixed"/>
+        <w:tblLook w:firstColumn="1" w:firstRow="1" w:lastColumn="0" w:lastRow="0" w:noHBand="0" w:noVBand="1" w:val="04A0"/>
+      </w:tblPr>
+      <w:tblGrid>
+        <w:gridCol w:w="1608"/>
+        <w:gridCol w:w="1608"/>
+        <w:gridCol w:w="1608"/>
+        <w:gridCol w:w="1608"/>
+        <w:gridCol w:w="1608"/>
+        <w:gridCol w:w="1608"/>
+      </w:tblGrid>
+      <w:tr>
+        <w:trPr>
+          <w:tblHeader w:val="true"/>
+        </w:trPr>
+        <w:tc>
+          <w:tcPr>
+            <w:tcW w:type="dxa" w:w="3312"/>
+            <w:vAlign w:val="center"/>
+            <w:tcMar>
+              <w:top w:w="60" w:type="dxa"/>
+              <w:left w:w="60" w:type="dxa"/>
+              <w:bottom w:w="60" w:type="dxa"/>
+              <w:right w:w="60" w:type="dxa"/>
+            </w:tcMar>
+          </w:tcPr>
+          <w:p>
+            <w:pPr>
+              <w:spacing w:after="0"/>
+            </w:pPr>
+            <w:r>
+              <w:rPr>
+                <w:b/>
+                <w:sz w:val="16"/>
+              </w:rPr>
+              <w:t>Configuration</w:t>
+            </w:r>
+          </w:p>
+        </w:tc>
+        <w:tc>
+          <w:tcPr>
+            <w:tcW w:type="dxa" w:w="1109"/>
+            <w:vAlign w:val="center"/>
+            <w:tcMar>
+              <w:top w:w="60" w:type="dxa"/>
+              <w:left w:w="60" w:type="dxa"/>
+              <w:bottom w:w="60" w:type="dxa"/>
+              <w:right w:w="60" w:type="dxa"/>
+            </w:tcMar>
+          </w:tcPr>
+          <w:p>
+            <w:pPr>
+              <w:spacing w:after="0"/>
+              <w:jc w:val="center"/>
+            </w:pPr>
+            <w:r>
+              <w:rPr>
+                <w:b/>
+                <w:sz w:val="16"/>
+              </w:rPr>
+              <w:t>Accuracy</w:t>
+            </w:r>
+          </w:p>
+        </w:tc>
+        <w:tc>
+          <w:tcPr>
+            <w:tcW w:type="dxa" w:w="1123"/>
+            <w:vAlign w:val="center"/>
+            <w:tcMar>
+              <w:top w:w="60" w:type="dxa"/>
+              <w:left w:w="60" w:type="dxa"/>
+              <w:bottom w:w="60" w:type="dxa"/>
+              <w:right w:w="60" w:type="dxa"/>
+            </w:tcMar>
+          </w:tcPr>
+          <w:p>
+            <w:pPr>
+              <w:spacing w:after="0"/>
+              <w:jc w:val="center"/>
+            </w:pPr>
+            <w:r>
+              <w:rPr>
+                <w:b/>
+                <w:sz w:val="16"/>
+              </w:rPr>
+              <w:t>Precision</w:t>
+            </w:r>
+          </w:p>
+        </w:tc>
+        <w:tc>
+          <w:tcPr>
+            <w:tcW w:type="dxa" w:w="965"/>
+            <w:vAlign w:val="center"/>
+            <w:tcMar>
+              <w:top w:w="60" w:type="dxa"/>
+              <w:left w:w="60" w:type="dxa"/>
+              <w:bottom w:w="60" w:type="dxa"/>
+              <w:right w:w="60" w:type="dxa"/>
+            </w:tcMar>
+          </w:tcPr>
+          <w:p>
+            <w:pPr>
+              <w:spacing w:after="0"/>
+              <w:jc w:val="center"/>
+            </w:pPr>
+            <w:r>
+              <w:rPr>
+                <w:b/>
+                <w:sz w:val="16"/>
+              </w:rPr>
+              <w:t>Recall</w:t>
+            </w:r>
+          </w:p>
+        </w:tc>
+        <w:tc>
+          <w:tcPr>
+            <w:tcW w:type="dxa" w:w="749"/>
+            <w:vAlign w:val="center"/>
+            <w:tcMar>
+              <w:top w:w="60" w:type="dxa"/>
+              <w:left w:w="60" w:type="dxa"/>
+              <w:bottom w:w="60" w:type="dxa"/>
+              <w:right w:w="60" w:type="dxa"/>
+            </w:tcMar>
+          </w:tcPr>
+          <w:p>
+            <w:pPr>
+              <w:spacing w:after="0"/>
+              <w:jc w:val="center"/>
+            </w:pPr>
+            <w:r>
+              <w:rPr>
+                <w:b/>
+                <w:sz w:val="16"/>
+              </w:rPr>
+              <w:t>FAR</w:t>
+            </w:r>
+          </w:p>
+        </w:tc>
+        <w:tc>
+          <w:tcPr>
+            <w:tcW w:type="dxa" w:w="749"/>
+            <w:vAlign w:val="center"/>
+            <w:tcMar>
+              <w:top w:w="60" w:type="dxa"/>
+              <w:left w:w="60" w:type="dxa"/>
+              <w:bottom w:w="60" w:type="dxa"/>
+              <w:right w:w="60" w:type="dxa"/>
+            </w:tcMar>
+          </w:tcPr>
+          <w:p>
+            <w:pPr>
+              <w:spacing w:after="0"/>
+              <w:jc w:val="center"/>
+            </w:pPr>
+            <w:r>
+              <w:rPr>
+                <w:b/>
+                <w:sz w:val="16"/>
+              </w:rPr>
+              <w:t>FRR</w:t>
+            </w:r>
+          </w:p>
+        </w:tc>
+      </w:tr>
+      <w:tr>
+        <w:tc>
+          <w:tcPr>
+            <w:tcW w:type="dxa" w:w="3312"/>
+            <w:vAlign w:val="center"/>
+            <w:tcMar>
+              <w:top w:w="60" w:type="dxa"/>
+              <w:left w:w="60" w:type="dxa"/>
+              <w:bottom w:w="60" w:type="dxa"/>
+              <w:right w:w="60" w:type="dxa"/>
+            </w:tcMar>
+          </w:tcPr>
+          <w:p>
+            <w:pPr>
+              <w:spacing w:after="0"/>
+            </w:pPr>
+            <w:r>
+              <w:rPr>
+                <w:sz w:val="16"/>
+              </w:rPr>
+              <w:t>Visible tests only</w:t>
+            </w:r>
+          </w:p>
+        </w:tc>
+        <w:tc>
+          <w:tcPr>
+            <w:tcW w:type="dxa" w:w="1109"/>
+            <w:vAlign w:val="center"/>
+            <w:tcMar>
+              <w:top w:w="60" w:type="dxa"/>
+              <w:left w:w="60" w:type="dxa"/>
+              <w:bottom w:w="60" w:type="dxa"/>
+              <w:right w:w="60" w:type="dxa"/>
+            </w:tcMar>
+          </w:tcPr>
+          <w:p>
+            <w:pPr>
+              <w:spacing w:after="0"/>
+              <w:jc w:val="center"/>
+            </w:pPr>
+            <w:r>
+              <w:rPr>
+                <w:sz w:val="16"/>
+              </w:rPr>
+              <w:t>72.9%</w:t>
+            </w:r>
+          </w:p>
+        </w:tc>
+        <w:tc>
+          <w:tcPr>
+            <w:tcW w:type="dxa" w:w="1123"/>
+            <w:vAlign w:val="center"/>
+            <w:tcMar>
+              <w:top w:w="60" w:type="dxa"/>
+              <w:left w:w="60" w:type="dxa"/>
+              <w:bottom w:w="60" w:type="dxa"/>
+              <w:right w:w="60" w:type="dxa"/>
+            </w:tcMar>
+          </w:tcPr>
+          <w:p>
+            <w:pPr>
+              <w:spacing w:after="0"/>
+              <w:jc w:val="center"/>
+            </w:pPr>
+            <w:r>
+              <w:rPr>
+                <w:sz w:val="16"/>
+              </w:rPr>
+              <w:t>70.2%</w:t>
+            </w:r>
+          </w:p>
+        </w:tc>
+        <w:tc>
+          <w:tcPr>
+            <w:tcW w:type="dxa" w:w="965"/>
+            <w:vAlign w:val="center"/>
+            <w:tcMar>
+              <w:top w:w="60" w:type="dxa"/>
+              <w:left w:w="60" w:type="dxa"/>
+              <w:bottom w:w="60" w:type="dxa"/>
+              <w:right w:w="60" w:type="dxa"/>
+            </w:tcMar>
+          </w:tcPr>
+          <w:p>
+            <w:pPr>
+              <w:spacing w:after="0"/>
+              <w:jc w:val="center"/>
+            </w:pPr>
+            <w:r>
+              <w:rPr>
+                <w:sz w:val="16"/>
+              </w:rPr>
+              <w:t>100.0%</w:t>
+            </w:r>
+          </w:p>
+        </w:tc>
+        <w:tc>
+          <w:tcPr>
+            <w:tcW w:type="dxa" w:w="749"/>
+            <w:vAlign w:val="center"/>
+            <w:tcMar>
+              <w:top w:w="60" w:type="dxa"/>
+              <w:left w:w="60" w:type="dxa"/>
+              <w:bottom w:w="60" w:type="dxa"/>
+              <w:right w:w="60" w:type="dxa"/>
+            </w:tcMar>
+          </w:tcPr>
+          <w:p>
+            <w:pPr>
+              <w:spacing w:after="0"/>
+              <w:jc w:val="center"/>
+            </w:pPr>
+            <w:r>
+              <w:rPr>
+                <w:sz w:val="16"/>
+              </w:rPr>
+              <w:t>74.7%</w:t>
+            </w:r>
+          </w:p>
+        </w:tc>
+        <w:tc>
+          <w:tcPr>
+            <w:tcW w:type="dxa" w:w="749"/>
+            <w:vAlign w:val="center"/>
+            <w:tcMar>
+              <w:top w:w="60" w:type="dxa"/>
+              <w:left w:w="60" w:type="dxa"/>
+              <w:bottom w:w="60" w:type="dxa"/>
+              <w:right w:w="60" w:type="dxa"/>
+            </w:tcMar>
+          </w:tcPr>
+          <w:p>
+            <w:pPr>
+              <w:spacing w:after="0"/>
+              <w:jc w:val="center"/>
+            </w:pPr>
+            <w:r>
+              <w:rPr>
+                <w:sz w:val="16"/>
+              </w:rPr>
+              <w:t>0.0%</w:t>
+            </w:r>
+          </w:p>
+        </w:tc>
+      </w:tr>
+      <w:tr>
+        <w:tc>
+          <w:tcPr>
+            <w:tcW w:type="dxa" w:w="3312"/>
+            <w:vAlign w:val="center"/>
+            <w:tcMar>
+              <w:top w:w="60" w:type="dxa"/>
+              <w:left w:w="60" w:type="dxa"/>
+              <w:bottom w:w="60" w:type="dxa"/>
+              <w:right w:w="60" w:type="dxa"/>
+            </w:tcMar>
+          </w:tcPr>
+          <w:p>
+            <w:pPr>
+              <w:spacing w:after="0"/>
+            </w:pPr>
+            <w:r>
+              <w:rPr>
+                <w:sz w:val="16"/>
+              </w:rPr>
+              <w:t>Visible + hidden</w:t>
+            </w:r>
+          </w:p>
+        </w:tc>
+        <w:tc>
+          <w:tcPr>
+            <w:tcW w:type="dxa" w:w="1109"/>
+            <w:vAlign w:val="center"/>
+            <w:tcMar>
+              <w:top w:w="60" w:type="dxa"/>
+              <w:left w:w="60" w:type="dxa"/>
+              <w:bottom w:w="60" w:type="dxa"/>
+              <w:right w:w="60" w:type="dxa"/>
+            </w:tcMar>
+          </w:tcPr>
+          <w:p>
+            <w:pPr>
+              <w:spacing w:after="0"/>
+              <w:jc w:val="center"/>
+            </w:pPr>
+            <w:r>
+              <w:rPr>
+                <w:sz w:val="16"/>
+              </w:rPr>
+              <w:t>90.0%</w:t>
+            </w:r>
+          </w:p>
+        </w:tc>
+        <w:tc>
+          <w:tcPr>
+            <w:tcW w:type="dxa" w:w="1123"/>
+            <w:vAlign w:val="center"/>
+            <w:tcMar>
+              <w:top w:w="60" w:type="dxa"/>
+              <w:left w:w="60" w:type="dxa"/>
+              <w:bottom w:w="60" w:type="dxa"/>
+              <w:right w:w="60" w:type="dxa"/>
+            </w:tcMar>
+          </w:tcPr>
+          <w:p>
+            <w:pPr>
+              <w:spacing w:after="0"/>
+              <w:jc w:val="center"/>
+            </w:pPr>
+            <w:r>
+              <w:rPr>
+                <w:sz w:val="16"/>
+              </w:rPr>
+              <w:t>86.4%</w:t>
+            </w:r>
+          </w:p>
+        </w:tc>
+        <w:tc>
+          <w:tcPr>
+            <w:tcW w:type="dxa" w:w="965"/>
+            <w:vAlign w:val="center"/>
+            <w:tcMar>
+              <w:top w:w="60" w:type="dxa"/>
+              <w:left w:w="60" w:type="dxa"/>
+              <w:bottom w:w="60" w:type="dxa"/>
+              <w:right w:w="60" w:type="dxa"/>
+            </w:tcMar>
+          </w:tcPr>
+          <w:p>
+            <w:pPr>
+              <w:spacing w:after="0"/>
+              <w:jc w:val="center"/>
+            </w:pPr>
+            <w:r>
+              <w:rPr>
+                <w:sz w:val="16"/>
+              </w:rPr>
+              <w:t>100.0%</w:t>
+            </w:r>
+          </w:p>
+        </w:tc>
+        <w:tc>
+          <w:tcPr>
+            <w:tcW w:type="dxa" w:w="749"/>
+            <w:vAlign w:val="center"/>
+            <w:tcMar>
+              <w:top w:w="60" w:type="dxa"/>
+              <w:left w:w="60" w:type="dxa"/>
+              <w:bottom w:w="60" w:type="dxa"/>
+              <w:right w:w="60" w:type="dxa"/>
+            </w:tcMar>
+          </w:tcPr>
+          <w:p>
+            <w:pPr>
+              <w:spacing w:after="0"/>
+              <w:jc w:val="center"/>
+            </w:pPr>
+            <w:r>
+              <w:rPr>
+                <w:sz w:val="16"/>
+              </w:rPr>
+              <w:t>27.6%</w:t>
+            </w:r>
+          </w:p>
+        </w:tc>
+        <w:tc>
+          <w:tcPr>
+            <w:tcW w:type="dxa" w:w="749"/>
+            <w:vAlign w:val="center"/>
+            <w:tcMar>
+              <w:top w:w="60" w:type="dxa"/>
+              <w:left w:w="60" w:type="dxa"/>
+              <w:bottom w:w="60" w:type="dxa"/>
+              <w:right w:w="60" w:type="dxa"/>
+            </w:tcMar>
+          </w:tcPr>
+          <w:p>
+            <w:pPr>
+              <w:spacing w:after="0"/>
+              <w:jc w:val="center"/>
+            </w:pPr>
+            <w:r>
+              <w:rPr>
+                <w:sz w:val="16"/>
+              </w:rPr>
+              <w:t>0.0%</w:t>
+            </w:r>
+          </w:p>
+        </w:tc>
+      </w:tr>
+      <w:tr>
+        <w:tc>
+          <w:tcPr>
+            <w:tcW w:type="dxa" w:w="3312"/>
+            <w:vAlign w:val="center"/>
+            <w:tcMar>
+              <w:top w:w="60" w:type="dxa"/>
+              <w:left w:w="60" w:type="dxa"/>
+              <w:bottom w:w="60" w:type="dxa"/>
+              <w:right w:w="60" w:type="dxa"/>
+            </w:tcMar>
+          </w:tcPr>
+          <w:p>
+            <w:pPr>
+              <w:spacing w:after="0"/>
+            </w:pPr>
+            <w:r>
+              <w:rPr>
+                <w:sz w:val="16"/>
+              </w:rPr>
+              <w:t>Visible + hidden + behavior</w:t>
+            </w:r>
+          </w:p>
+        </w:tc>
+        <w:tc>
+          <w:tcPr>
+            <w:tcW w:type="dxa" w:w="1109"/>
+            <w:vAlign w:val="center"/>
+            <w:tcMar>
+              <w:top w:w="60" w:type="dxa"/>
+              <w:left w:w="60" w:type="dxa"/>
+              <w:bottom w:w="60" w:type="dxa"/>
+              <w:right w:w="60" w:type="dxa"/>
+            </w:tcMar>
+          </w:tcPr>
+          <w:p>
+            <w:pPr>
+              <w:spacing w:after="0"/>
+              <w:jc w:val="center"/>
+            </w:pPr>
+            <w:r>
+              <w:rPr>
+                <w:sz w:val="16"/>
+              </w:rPr>
+              <w:t>100.0%</w:t>
+            </w:r>
+          </w:p>
+        </w:tc>
+        <w:tc>
+          <w:tcPr>
+            <w:tcW w:type="dxa" w:w="1123"/>
+            <w:vAlign w:val="center"/>
+            <w:tcMar>
+              <w:top w:w="60" w:type="dxa"/>
+              <w:left w:w="60" w:type="dxa"/>
+              <w:bottom w:w="60" w:type="dxa"/>
+              <w:right w:w="60" w:type="dxa"/>
+            </w:tcMar>
+          </w:tcPr>
+          <w:p>
+            <w:pPr>
+              <w:spacing w:after="0"/>
+              <w:jc w:val="center"/>
+            </w:pPr>
+            <w:r>
+              <w:rPr>
+                <w:sz w:val="16"/>
+              </w:rPr>
+              <w:t>100.0%</w:t>
+            </w:r>
+          </w:p>
+        </w:tc>
+        <w:tc>
+          <w:tcPr>
+            <w:tcW w:type="dxa" w:w="965"/>
+            <w:vAlign w:val="center"/>
+            <w:tcMar>
+              <w:top w:w="60" w:type="dxa"/>
+              <w:left w:w="60" w:type="dxa"/>
+              <w:bottom w:w="60" w:type="dxa"/>
+              <w:right w:w="60" w:type="dxa"/>
+            </w:tcMar>
+          </w:tcPr>
+          <w:p>
+            <w:pPr>
+              <w:spacing w:after="0"/>
+              <w:jc w:val="center"/>
+            </w:pPr>
+            <w:r>
+              <w:rPr>
+                <w:sz w:val="16"/>
+              </w:rPr>
+              <w:t>100.0%</w:t>
+            </w:r>
+          </w:p>
+        </w:tc>
+        <w:tc>
+          <w:tcPr>
+            <w:tcW w:type="dxa" w:w="749"/>
+            <w:vAlign w:val="center"/>
+            <w:tcMar>
+              <w:top w:w="60" w:type="dxa"/>
+              <w:left w:w="60" w:type="dxa"/>
+              <w:bottom w:w="60" w:type="dxa"/>
+              <w:right w:w="60" w:type="dxa"/>
+            </w:tcMar>
+          </w:tcPr>
+          <w:p>
+            <w:pPr>
+              <w:spacing w:after="0"/>
+              <w:jc w:val="center"/>
+            </w:pPr>
+            <w:r>
+              <w:rPr>
+                <w:sz w:val="16"/>
+              </w:rPr>
+              <w:t>0.0%</w:t>
+            </w:r>
+          </w:p>
+        </w:tc>
+        <w:tc>
+          <w:tcPr>
+            <w:tcW w:type="dxa" w:w="749"/>
+            <w:vAlign w:val="center"/>
+            <w:tcMar>
+              <w:top w:w="60" w:type="dxa"/>
+              <w:left w:w="60" w:type="dxa"/>
+              <w:bottom w:w="60" w:type="dxa"/>
+              <w:right w:w="60" w:type="dxa"/>
+            </w:tcMar>
+          </w:tcPr>
+          <w:p>
+            <w:pPr>
+              <w:spacing w:after="0"/>
+              <w:jc w:val="center"/>
+            </w:pPr>
+            <w:r>
+              <w:rPr>
+                <w:sz w:val="16"/>
+              </w:rPr>
+              <w:t>0.0%</w:t>
+            </w:r>
+          </w:p>
+        </w:tc>
+      </w:tr>
+      <w:tr>
+        <w:tc>
+          <w:tcPr>
+            <w:tcW w:type="dxa" w:w="3312"/>
+            <w:vAlign w:val="center"/>
+            <w:tcMar>
+              <w:top w:w="60" w:type="dxa"/>
+              <w:left w:w="60" w:type="dxa"/>
+              <w:bottom w:w="60" w:type="dxa"/>
+              <w:right w:w="60" w:type="dxa"/>
+            </w:tcMar>
+          </w:tcPr>
+          <w:p>
+            <w:pPr>
+              <w:spacing w:after="0"/>
+            </w:pPr>
+            <w:r>
+              <w:rPr>
+                <w:sz w:val="16"/>
+              </w:rPr>
+              <w:t>Visible + hidden + structure</w:t>
+            </w:r>
+          </w:p>
+        </w:tc>
+        <w:tc>
+          <w:tcPr>
+            <w:tcW w:type="dxa" w:w="1109"/>
+            <w:vAlign w:val="center"/>
+            <w:tcMar>
+              <w:top w:w="60" w:type="dxa"/>
+              <w:left w:w="60" w:type="dxa"/>
+              <w:bottom w:w="60" w:type="dxa"/>
+              <w:right w:w="60" w:type="dxa"/>
+            </w:tcMar>
+          </w:tcPr>
+          <w:p>
+            <w:pPr>
+              <w:spacing w:after="0"/>
+              <w:jc w:val="center"/>
+            </w:pPr>
+            <w:r>
+              <w:rPr>
+                <w:sz w:val="16"/>
+              </w:rPr>
+              <w:t>89.6%</w:t>
+            </w:r>
+          </w:p>
+        </w:tc>
+        <w:tc>
+          <w:tcPr>
+            <w:tcW w:type="dxa" w:w="1123"/>
+            <w:vAlign w:val="center"/>
+            <w:tcMar>
+              <w:top w:w="60" w:type="dxa"/>
+              <w:left w:w="60" w:type="dxa"/>
+              <w:bottom w:w="60" w:type="dxa"/>
+              <w:right w:w="60" w:type="dxa"/>
+            </w:tcMar>
+          </w:tcPr>
+          <w:p>
+            <w:pPr>
+              <w:spacing w:after="0"/>
+              <w:jc w:val="center"/>
+            </w:pPr>
+            <w:r>
+              <w:rPr>
+                <w:sz w:val="16"/>
+              </w:rPr>
+              <w:t>86.4%</w:t>
+            </w:r>
+          </w:p>
+        </w:tc>
+        <w:tc>
+          <w:tcPr>
+            <w:tcW w:type="dxa" w:w="965"/>
+            <w:vAlign w:val="center"/>
+            <w:tcMar>
+              <w:top w:w="60" w:type="dxa"/>
+              <w:left w:w="60" w:type="dxa"/>
+              <w:bottom w:w="60" w:type="dxa"/>
+              <w:right w:w="60" w:type="dxa"/>
+            </w:tcMar>
+          </w:tcPr>
+          <w:p>
+            <w:pPr>
+              <w:spacing w:after="0"/>
+              <w:jc w:val="center"/>
+            </w:pPr>
+            <w:r>
+              <w:rPr>
+                <w:sz w:val="16"/>
+              </w:rPr>
+              <w:t>99.3%</w:t>
+            </w:r>
+          </w:p>
+        </w:tc>
+        <w:tc>
+          <w:tcPr>
+            <w:tcW w:type="dxa" w:w="749"/>
+            <w:vAlign w:val="center"/>
+            <w:tcMar>
+              <w:top w:w="60" w:type="dxa"/>
+              <w:left w:w="60" w:type="dxa"/>
+              <w:bottom w:w="60" w:type="dxa"/>
+              <w:right w:w="60" w:type="dxa"/>
+            </w:tcMar>
+          </w:tcPr>
+          <w:p>
+            <w:pPr>
+              <w:spacing w:after="0"/>
+              <w:jc w:val="center"/>
+            </w:pPr>
+            <w:r>
+              <w:rPr>
+                <w:sz w:val="16"/>
+              </w:rPr>
+              <w:t>27.6%</w:t>
+            </w:r>
+          </w:p>
+        </w:tc>
+        <w:tc>
+          <w:tcPr>
+            <w:tcW w:type="dxa" w:w="749"/>
+            <w:vAlign w:val="center"/>
+            <w:tcMar>
+              <w:top w:w="60" w:type="dxa"/>
+              <w:left w:w="60" w:type="dxa"/>
+              <w:bottom w:w="60" w:type="dxa"/>
+              <w:right w:w="60" w:type="dxa"/>
+            </w:tcMar>
+          </w:tcPr>
+          <w:p>
+            <w:pPr>
+              <w:spacing w:after="0"/>
+              <w:jc w:val="center"/>
+            </w:pPr>
+            <w:r>
+              <w:rPr>
+                <w:sz w:val="16"/>
+              </w:rPr>
+              <w:t>0.7%</w:t>
+            </w:r>
+          </w:p>
+        </w:tc>
+      </w:tr>
+      <w:tr>
+        <w:tc>
+          <w:tcPr>
+            <w:tcW w:type="dxa" w:w="3312"/>
+            <w:vAlign w:val="center"/>
+            <w:tcMar>
+              <w:top w:w="60" w:type="dxa"/>
+              <w:left w:w="60" w:type="dxa"/>
+              <w:bottom w:w="60" w:type="dxa"/>
+              <w:right w:w="60" w:type="dxa"/>
+            </w:tcMar>
+          </w:tcPr>
+          <w:p>
+            <w:pPr>
+              <w:spacing w:after="0"/>
+            </w:pPr>
+            <w:r>
+              <w:rPr>
+                <w:sz w:val="16"/>
+              </w:rPr>
+              <w:t>Full VERA-SE</w:t>
+            </w:r>
+          </w:p>
+        </w:tc>
+        <w:tc>
+          <w:tcPr>
+            <w:tcW w:type="dxa" w:w="1109"/>
+            <w:vAlign w:val="center"/>
+            <w:tcMar>
+              <w:top w:w="60" w:type="dxa"/>
+              <w:left w:w="60" w:type="dxa"/>
+              <w:bottom w:w="60" w:type="dxa"/>
+              <w:right w:w="60" w:type="dxa"/>
+            </w:tcMar>
+          </w:tcPr>
+          <w:p>
+            <w:pPr>
+              <w:spacing w:after="0"/>
+              <w:jc w:val="center"/>
+            </w:pPr>
+            <w:r>
+              <w:rPr>
+                <w:sz w:val="16"/>
+              </w:rPr>
+              <w:t>99.6%</w:t>
+            </w:r>
+          </w:p>
+        </w:tc>
+        <w:tc>
+          <w:tcPr>
+            <w:tcW w:type="dxa" w:w="1123"/>
+            <w:vAlign w:val="center"/>
+            <w:tcMar>
+              <w:top w:w="60" w:type="dxa"/>
+              <w:left w:w="60" w:type="dxa"/>
+              <w:bottom w:w="60" w:type="dxa"/>
+              <w:right w:w="60" w:type="dxa"/>
+            </w:tcMar>
+          </w:tcPr>
+          <w:p>
+            <w:pPr>
+              <w:spacing w:after="0"/>
+              <w:jc w:val="center"/>
+            </w:pPr>
+            <w:r>
+              <w:rPr>
+                <w:sz w:val="16"/>
+              </w:rPr>
+              <w:t>100.0%</w:t>
+            </w:r>
+          </w:p>
+        </w:tc>
+        <w:tc>
+          <w:tcPr>
+            <w:tcW w:type="dxa" w:w="965"/>
+            <w:vAlign w:val="center"/>
+            <w:tcMar>
+              <w:top w:w="60" w:type="dxa"/>
+              <w:left w:w="60" w:type="dxa"/>
+              <w:bottom w:w="60" w:type="dxa"/>
+              <w:right w:w="60" w:type="dxa"/>
+            </w:tcMar>
+          </w:tcPr>
+          <w:p>
+            <w:pPr>
+              <w:spacing w:after="0"/>
+              <w:jc w:val="center"/>
+            </w:pPr>
+            <w:r>
+              <w:rPr>
+                <w:sz w:val="16"/>
+              </w:rPr>
+              <w:t>99.3%</w:t>
+            </w:r>
+          </w:p>
+        </w:tc>
+        <w:tc>
+          <w:tcPr>
+            <w:tcW w:type="dxa" w:w="749"/>
+            <w:vAlign w:val="center"/>
+            <w:tcMar>
+              <w:top w:w="60" w:type="dxa"/>
+              <w:left w:w="60" w:type="dxa"/>
+              <w:bottom w:w="60" w:type="dxa"/>
+              <w:right w:w="60" w:type="dxa"/>
+            </w:tcMar>
+          </w:tcPr>
+          <w:p>
+            <w:pPr>
+              <w:spacing w:after="0"/>
+              <w:jc w:val="center"/>
+            </w:pPr>
+            <w:r>
+              <w:rPr>
+                <w:sz w:val="16"/>
+              </w:rPr>
+              <w:t>0.0%</w:t>
+            </w:r>
+          </w:p>
+        </w:tc>
+        <w:tc>
+          <w:tcPr>
+            <w:tcW w:type="dxa" w:w="749"/>
+            <w:vAlign w:val="center"/>
+            <w:tcMar>
+              <w:top w:w="60" w:type="dxa"/>
+              <w:left w:w="60" w:type="dxa"/>
+              <w:bottom w:w="60" w:type="dxa"/>
+              <w:right w:w="60" w:type="dxa"/>
+            </w:tcMar>
+          </w:tcPr>
+          <w:p>
+            <w:pPr>
+              <w:spacing w:after="0"/>
+              <w:jc w:val="center"/>
+            </w:pPr>
+            <w:r>
+              <w:rPr>
+                <w:sz w:val="16"/>
+              </w:rPr>
+              <w:t>0.7%</w:t>
+            </w:r>
+          </w:p>
+        </w:tc>
+      </w:tr>
+    </w:tbl>
+    <w:p>
+      <w:pPr/>
+      <w:r>
+        <w:t>Visible-only validation falsely accepted 65 of the 87 incorrect candidates. Adding hidden tests reduced the number of false acceptances to 24, corresponding to an FAR of 27.6%.</w:t>
+      </w:r>
+    </w:p>
+    <w:p>
+      <w:pPr/>
+      <w:r>
+        <w:t>The configuration combining visible tests, hidden tests, and behavioral preservation checks accepted all 153 correct candidates and rejected all 87 incorrect candidates in this controlled dataset. It therefore achieved zero observed false acceptance and zero observed false rejection.</w:t>
+      </w:r>
+    </w:p>
+    <w:p>
+      <w:pPr/>
+      <w:r>
+        <w:t>Adding structural verification without behavioral preservation did not further reduce false acceptance relative to visible-plus-hidden validation. It rejected one correct candidate, producing an FRR of 0.7%. The full VERA-SE configuration eliminated all 24 remaining false acceptances but retained the single false rejection associated with structural verification.</w:t>
+      </w:r>
+    </w:p>
+    <w:p>
+      <w:pPr/>
+      <w:r>
+        <w:t>These findings indicate that task-specific behavioral preservation checks account for the observed reduction in false acceptance beyond additional testing. Structural constraints provided repair-scope evidence but did not independently improve discrimination of incorrect patches in this benchmark. The results concern repeated candidate instances from six controlled tasks, not independent real-world defects.</w:t>
       </w:r>
     </w:p>
     <w:p>
@@ -1526,10 +2454,7 @@
         <w:jc w:val="center"/>
       </w:pPr>
       <w:r>
-        <w:rPr>
-          <w:b/>
-        </w:rPr>
-        <w:t>Table 2. Real-world pilot generation summary.</w:t>
+        <w:t>Table 3. Real-world pilot generation summary.</w:t>
       </w:r>
     </w:p>
     <w:tbl>
@@ -1877,10 +2802,7 @@
         <w:jc w:val="center"/>
       </w:pPr>
       <w:r>
-        <w:rPr>
-          <w:b/>
-        </w:rPr>
-        <w:t>Table 3. Real-world pilot: candidate-level classification (28 valid instances).</w:t>
+        <w:t>Table 4. Real-world pilot: candidate-level classification (28 valid instances).</w:t>
       </w:r>
     </w:p>
     <w:tbl>
@@ -2492,10 +3414,7 @@
         <w:jc w:val="center"/>
       </w:pPr>
       <w:r>
-        <w:rPr>
-          <w:b/>
-        </w:rPr>
-        <w:t>Table 4. Black-9 case study.</w:t>
+        <w:t>Table 5. Black-9 case study.</w:t>
       </w:r>
     </w:p>
     <w:tbl>

</xml_diff>

<commit_message>
Finalize audited VERA-SE manuscript
</commit_message>
<xml_diff>
--- a/paper/VERA_SE_Manuscript.docx
+++ b/paper/VERA_SE_Manuscript.docx
@@ -20,14 +20,6 @@
           <w:b/>
         </w:rPr>
         <w:t>Mridula Prabhakar</w:t>
-      </w:r>
-    </w:p>
-    <w:p>
-      <w:pPr>
-        <w:jc w:val="center"/>
-      </w:pPr>
-      <w:r>
-        <w:t>Complete working manuscript draft — Sections 1–8 | September 2026 | References and reproducibility release pending final audit</w:t>
       </w:r>
     </w:p>
     <w:p>
@@ -113,7 +105,7 @@
     </w:p>
     <w:p>
       <w:r>
-        <w:t>The remainder of the paper describes related work, the VERA-SE architecture and verification model, the controlled and real-world methodologies, the results and ablation findings, and threats to validity.</w:t>
+        <w:t>The remainder of the paper describes related work, the VERA-SE architecture and verification model, the controlled and real-world methodologies, the results and ablation findings, the implications of the observed transfer gap, threats to validity, and conclusions.</w:t>
       </w:r>
     </w:p>
     <w:p>
@@ -637,7 +629,7 @@
     </w:p>
     <w:p>
       <w:r>
-        <w:t>Each task requested four generations using a local Qwen2.5-Coder 7B model via Ollama. Invalid generated source was retained as an unsuccessful requested generation; it was not silently replaced to force four valid patches. The frozen evaluation is assembled from run IDs 20260904_164914 and 20260904_171236. A later modified and interrupted generator run is excluded.</w:t>
+        <w:t>Each task used four requested candidate-generation slots with a local Qwen2.5-Coder 7B model via Ollama. Invalid generations remained unsuccessful slots; they were not repeatedly replaced until four valid patches were obtained. The frozen evaluation is assembled from run IDs 20260904_164914 and 20260904_171236. A later modified and interrupted generator run is excluded.</w:t>
       </w:r>
     </w:p>
     <w:p>
@@ -820,6 +812,9 @@
             </w:r>
           </w:p>
         </w:tc>
+        <w:trPr>
+          <w:tblHeader/>
+        </w:trPr>
       </w:tr>
       <w:tr>
         <w:tc>
@@ -2509,6 +2504,9 @@
             </w:r>
           </w:p>
         </w:tc>
+        <w:trPr>
+          <w:tblHeader/>
+        </w:trPr>
       </w:tr>
       <w:tr>
         <w:tc>
@@ -2878,6 +2876,9 @@
             </w:r>
           </w:p>
         </w:tc>
+        <w:trPr>
+          <w:tblHeader/>
+        </w:trPr>
       </w:tr>
       <w:tr>
         <w:tc>
@@ -3532,6 +3533,9 @@
             </w:r>
           </w:p>
         </w:tc>
+        <w:trPr>
+          <w:tblHeader/>
+        </w:trPr>
       </w:tr>
       <w:tr>
         <w:tc>
@@ -3826,7 +3830,7 @@
     </w:p>
     <w:p>
       <w:r>
-        <w:t>The frozen artifacts include task and candidate CSVs, requested-versus-valid counts, patched code, diffs, and source hashes. The authoritative pilot uses runs 20260904_164914 and 20260904_171236. A later generator modification and interrupted run are not included in the analysis. A reproduction release should preserve the precise code revision/configuration that produced the frozen runs; the current working-tree generator is not assumed identical to that frozen state.</w:t>
+        <w:t>The frozen artifacts include task and candidate CSVs, requested-versus-valid counts, patched code, diffs, and source hashes. The authoritative pilot uses runs 20260904_164914 and 20260904_171236; a later generator modification and interrupted run are excluded from the analysis. SHA-256 hashes have been recorded for the authoritative result files to support artifact-integrity checks. Git history was initialized after the experiments, so the current repository snapshot does not establish the exact historical generator revision. Accordingly, the frozen artifacts are treated as the authoritative experimental record, and end-to-end reproduction should not be claimed until the original generation configuration is reconstructed or independently preserved.</w:t>
       </w:r>
     </w:p>
     <w:p>
@@ -3862,7 +3866,7 @@
     </w:p>
     <w:p>
       <w:r>
-        <w:t>[2] J. Bader, A. Scott, M. Pradel, and S. Chandra, “Getafix: Learning to Fix Bugs Automatically,” Proceedings of the ACM on Programming Languages, vol. 3, OOPSLA, 2019. doi: 10.1145/3360585.</w:t>
+        <w:t>[2] J. Bader, A. Scott, M. Pradel, and S. Chandra, “Getafix: Learning to Fix Bugs Automatically,” Proc. ACM Program. Lang., vol. 3, OOPSLA, Art. no. 159, pp. 1–27, 2019. doi: 10.1145/3360585.</w:t>
       </w:r>
     </w:p>
     <w:p>
@@ -3872,12 +3876,12 @@
     </w:p>
     <w:p>
       <w:r>
-        <w:t>[4] C. E. Jimenez et al., “SWE-bench: Can Language Models Resolve Real-World GitHub Issues?” in International Conference on Learning Representations, 2024. https://openreview.net/forum?id=VTF8yNQM66.</w:t>
+        <w:t>[4] C. E. Jimenez et al., “SWE-bench: Can Language Models Resolve Real-World GitHub Issues?” in Proc. Int. Conf. Learn. Representations (ICLR), 2024.</w:t>
       </w:r>
     </w:p>
     <w:p>
       <w:r>
-        <w:t>[5] J. Yang et al., “SWE-agent: Agent-Computer Interfaces Enable Automated Software Engineering,” in Advances in Neural Information Processing Systems, vol. 37, 2024. doi: 10.52202/079017-1601.</w:t>
+        <w:t>[5] J. Yang et al., “SWE-agent: Agent-Computer Interfaces Enable Automated Software Engineering,” in Adv. Neural Inf. Process. Syst., vol. 37, 2024. doi: 10.52202/079017-1601.</w:t>
       </w:r>
     </w:p>
     <w:p>
@@ -3893,11 +3897,13 @@
     <w:p>
       <w:pPr/>
       <w:r>
-        <w:t>[8] R. Widyasari et al., “BugsInPy: A Database of Existing Bugs in Python Programs to Enable Controlled Testing and Debugging Studies,” in Proceedings of ESEC/FSE, 2020, pp. 1556–1560. doi: 10.1145/3368089.3417943.</w:t>
+        <w:t>[8] R. Widyasari et al., “BugsInPy: A Database of Existing Bugs in Python Programs to Enable Controlled Testing and Debugging Studies,” in Proc. 28th ACM Joint Eur. Softw. Eng. Conf. Symp. Found. Softw. Eng. (ESEC/FSE), 2020, pp. 1556–1560. doi: 10.1145/3368089.3417943.</w:t>
       </w:r>
     </w:p>
     <w:sectPr>
       <w:footerReference w:type="default" r:id="rId9"/>
+      <w:footerReference w:type="first" r:id="rId11"/>
+      <w:footerReference w:type="even" r:id="rId12"/>
       <w:pgSz w:w="12240" w:h="15840"/>
       <w:pgMar w:top="1109" w:right="1296" w:bottom="1109" w:left="1296" w:header="720" w:footer="720" w:gutter="0"/>
       <w:cols w:space="720"/>
@@ -3914,12 +3920,26 @@
       <w:pStyle w:val="Footer"/>
       <w:jc w:val="center"/>
     </w:pPr>
-    <w:r>
-      <w:rPr>
-        <w:sz w:val="16"/>
-      </w:rPr>
-      <w:t>VERA-SE | Working research manuscript</w:t>
-    </w:r>
+  </w:p>
+</w:ftr>
+</file>
+
+<file path=word/footer2.xml><?xml version="1.0" encoding="utf-8"?>
+<w:ftr xmlns:m="http://schemas.openxmlformats.org/officeDocument/2006/math" xmlns:mc="http://schemas.openxmlformats.org/markup-compatibility/2006" xmlns:mo="http://schemas.microsoft.com/office/mac/office/2008/main" xmlns:mv="urn:schemas-microsoft-com:mac:vml" xmlns:o="urn:schemas-microsoft-com:office:office" xmlns:r="http://schemas.openxmlformats.org/officeDocument/2006/relationships" xmlns:v="urn:schemas-microsoft-com:vml" xmlns:w10="urn:schemas-microsoft-com:office:word" xmlns:w14="http://schemas.microsoft.com/office/word/2010/wordml" xmlns:w="http://schemas.openxmlformats.org/wordprocessingml/2006/main" xmlns:wne="http://schemas.microsoft.com/office/word/2006/wordml" xmlns:wp14="http://schemas.microsoft.com/office/word/2010/wordprocessingDrawing" xmlns:wp="http://schemas.openxmlformats.org/drawingml/2006/wordprocessingDrawing" xmlns:wpc="http://schemas.microsoft.com/office/word/2010/wordprocessingCanvas" xmlns:wpg="http://schemas.microsoft.com/office/word/2010/wordprocessingGroup" xmlns:wpi="http://schemas.microsoft.com/office/word/2010/wordprocessingInk" xmlns:wps="http://schemas.microsoft.com/office/word/2010/wordprocessingShape" mc:Ignorable="w14 wp14">
+  <w:p>
+    <w:pPr>
+      <w:pStyle w:val="Footer"/>
+    </w:pPr>
+  </w:p>
+</w:ftr>
+</file>
+
+<file path=word/footer3.xml><?xml version="1.0" encoding="utf-8"?>
+<w:ftr xmlns:m="http://schemas.openxmlformats.org/officeDocument/2006/math" xmlns:mc="http://schemas.openxmlformats.org/markup-compatibility/2006" xmlns:mo="http://schemas.microsoft.com/office/mac/office/2008/main" xmlns:mv="urn:schemas-microsoft-com:mac:vml" xmlns:o="urn:schemas-microsoft-com:office:office" xmlns:r="http://schemas.openxmlformats.org/officeDocument/2006/relationships" xmlns:v="urn:schemas-microsoft-com:vml" xmlns:w10="urn:schemas-microsoft-com:office:word" xmlns:w14="http://schemas.microsoft.com/office/word/2010/wordml" xmlns:w="http://schemas.openxmlformats.org/wordprocessingml/2006/main" xmlns:wne="http://schemas.microsoft.com/office/word/2006/wordml" xmlns:wp14="http://schemas.microsoft.com/office/word/2010/wordprocessingDrawing" xmlns:wp="http://schemas.openxmlformats.org/drawingml/2006/wordprocessingDrawing" xmlns:wpc="http://schemas.microsoft.com/office/word/2010/wordprocessingCanvas" xmlns:wpg="http://schemas.microsoft.com/office/word/2010/wordprocessingGroup" xmlns:wpi="http://schemas.microsoft.com/office/word/2010/wordprocessingInk" xmlns:wps="http://schemas.microsoft.com/office/word/2010/wordprocessingShape" mc:Ignorable="w14 wp14">
+  <w:p>
+    <w:pPr>
+      <w:pStyle w:val="Footer"/>
+    </w:pPr>
   </w:p>
 </w:ftr>
 </file>

</xml_diff>